<commit_message>
fixed introduction of report
</commit_message>
<xml_diff>
--- a/helloworld/Fedorov_helloworld_report.docx
+++ b/helloworld/Fedorov_helloworld_report.docx
@@ -1,6 +1,6 @@
 
 <file path=word/document.xml><?xml version="1.0" encoding="utf-8"?>
-<w:document xmlns:wpc="http://schemas.microsoft.com/office/word/2010/wordprocessingCanvas" xmlns:cx="http://schemas.microsoft.com/office/drawing/2014/chartex" xmlns:cx1="http://schemas.microsoft.com/office/drawing/2015/9/8/chartex" xmlns:mc="http://schemas.openxmlformats.org/markup-compatibility/2006" xmlns:o="urn:schemas-microsoft-com:office:office" xmlns:r="http://schemas.openxmlformats.org/officeDocument/2006/relationships" xmlns:m="http://schemas.openxmlformats.org/officeDocument/2006/math" xmlns:v="urn:schemas-microsoft-com:vml" xmlns:wp14="http://schemas.microsoft.com/office/word/2010/wordprocessingDrawing" xmlns:wp="http://schemas.openxmlformats.org/drawingml/2006/wordprocessingDrawing" xmlns:w10="urn:schemas-microsoft-com:office:word" xmlns:w="http://schemas.openxmlformats.org/wordprocessingml/2006/main" xmlns:w14="http://schemas.microsoft.com/office/word/2010/wordml" xmlns:w15="http://schemas.microsoft.com/office/word/2012/wordml" xmlns:w16se="http://schemas.microsoft.com/office/word/2015/wordml/symex" xmlns:wpg="http://schemas.microsoft.com/office/word/2010/wordprocessingGroup" xmlns:wpi="http://schemas.microsoft.com/office/word/2010/wordprocessingInk" xmlns:wne="http://schemas.microsoft.com/office/word/2006/wordml" xmlns:wps="http://schemas.microsoft.com/office/word/2010/wordprocessingShape" mc:Ignorable="w14 w15 w16se wp14">
+<w:document xmlns:wpc="http://schemas.microsoft.com/office/word/2010/wordprocessingCanvas" xmlns:cx="http://schemas.microsoft.com/office/drawing/2014/chartex" xmlns:cx1="http://schemas.microsoft.com/office/drawing/2015/9/8/chartex" xmlns:cx2="http://schemas.microsoft.com/office/drawing/2015/10/21/chartex" xmlns:cx3="http://schemas.microsoft.com/office/drawing/2016/5/9/chartex" xmlns:cx4="http://schemas.microsoft.com/office/drawing/2016/5/10/chartex" xmlns:cx5="http://schemas.microsoft.com/office/drawing/2016/5/11/chartex" xmlns:cx6="http://schemas.microsoft.com/office/drawing/2016/5/12/chartex" xmlns:cx7="http://schemas.microsoft.com/office/drawing/2016/5/13/chartex" xmlns:cx8="http://schemas.microsoft.com/office/drawing/2016/5/14/chartex" xmlns:mc="http://schemas.openxmlformats.org/markup-compatibility/2006" xmlns:aink="http://schemas.microsoft.com/office/drawing/2016/ink" xmlns:am3d="http://schemas.microsoft.com/office/drawing/2017/model3d" xmlns:o="urn:schemas-microsoft-com:office:office" xmlns:r="http://schemas.openxmlformats.org/officeDocument/2006/relationships" xmlns:m="http://schemas.openxmlformats.org/officeDocument/2006/math" xmlns:v="urn:schemas-microsoft-com:vml" xmlns:wp14="http://schemas.microsoft.com/office/word/2010/wordprocessingDrawing" xmlns:wp="http://schemas.openxmlformats.org/drawingml/2006/wordprocessingDrawing" xmlns:w10="urn:schemas-microsoft-com:office:word" xmlns:w="http://schemas.openxmlformats.org/wordprocessingml/2006/main" xmlns:w14="http://schemas.microsoft.com/office/word/2010/wordml" xmlns:w15="http://schemas.microsoft.com/office/word/2012/wordml" xmlns:w16cex="http://schemas.microsoft.com/office/word/2018/wordml/cex" xmlns:w16cid="http://schemas.microsoft.com/office/word/2016/wordml/cid" xmlns:w16="http://schemas.microsoft.com/office/word/2018/wordml" xmlns:w16sdtdh="http://schemas.microsoft.com/office/word/2020/wordml/sdtdatahash" xmlns:w16se="http://schemas.microsoft.com/office/word/2015/wordml/symex" xmlns:wpg="http://schemas.microsoft.com/office/word/2010/wordprocessingGroup" xmlns:wpi="http://schemas.microsoft.com/office/word/2010/wordprocessingInk" xmlns:wne="http://schemas.microsoft.com/office/word/2006/wordml" xmlns:wps="http://schemas.microsoft.com/office/word/2010/wordprocessingShape" mc:Ignorable="w14 w15 w16se w16cid w16 w16cex w16sdtdh wp14">
   <w:body>
     <w:p>
       <w:pPr>
@@ -1418,103 +1418,16 @@
                 <w:szCs w:val="28"/>
                 <w:lang w:val="ru-RU"/>
               </w:rPr>
-              <w:t xml:space="preserve">Изучение оптимизаций компилятора </w:t>
+              <w:t>Изучение этапов компиляции……</w:t>
             </w:r>
             <w:r>
               <w:rPr>
                 <w:rFonts w:eastAsia="Times New Roman" w:cs="Times New Roman"/>
                 <w:color w:val="000000"/>
                 <w:szCs w:val="28"/>
-              </w:rPr>
-              <w:t>GCC</w:t>
-            </w:r>
-            <w:r>
-              <w:rPr>
-                <w:rFonts w:eastAsia="Times New Roman" w:cs="Times New Roman"/>
-                <w:color w:val="000000"/>
-                <w:szCs w:val="28"/>
                 <w:lang w:val="ru-RU"/>
               </w:rPr>
-              <w:t xml:space="preserve"> </w:t>
-            </w:r>
-            <w:r>
-              <w:rPr>
-                <w:rFonts w:eastAsia="Times New Roman" w:cs="Times New Roman"/>
-                <w:color w:val="000000"/>
-                <w:szCs w:val="28"/>
-                <w:lang w:val="ru-RU"/>
-              </w:rPr>
-              <w:t xml:space="preserve">на примере </w:t>
-            </w:r>
-            <w:r>
-              <w:rPr>
-                <w:rFonts w:eastAsia="Times New Roman" w:cs="Times New Roman"/>
-                <w:color w:val="000000"/>
-                <w:szCs w:val="28"/>
-              </w:rPr>
-              <w:t>optbench</w:t>
-            </w:r>
-            <w:r>
-              <w:rPr>
-                <w:rFonts w:eastAsia="Times New Roman" w:cs="Times New Roman"/>
-                <w:color w:val="000000"/>
-                <w:szCs w:val="28"/>
-                <w:lang w:val="ru-RU"/>
-              </w:rPr>
-              <w:t>.</w:t>
-            </w:r>
-            <w:r>
-              <w:rPr>
-                <w:rFonts w:eastAsia="Times New Roman" w:cs="Times New Roman"/>
-                <w:color w:val="000000"/>
-                <w:szCs w:val="28"/>
-              </w:rPr>
-              <w:t>c</w:t>
-            </w:r>
-            <w:r>
-              <w:rPr>
-                <w:rFonts w:eastAsia="Times New Roman" w:cs="Times New Roman"/>
-                <w:color w:val="000000"/>
-                <w:szCs w:val="28"/>
-                <w:lang w:val="ru-RU"/>
-              </w:rPr>
-              <w:t>.</w:t>
-            </w:r>
-            <w:r>
-              <w:rPr>
-                <w:rFonts w:eastAsia="Times New Roman" w:cs="Times New Roman"/>
-                <w:color w:val="000000"/>
-                <w:szCs w:val="28"/>
-                <w:lang w:val="ru-RU"/>
-              </w:rPr>
-              <w:t>…………</w:t>
-            </w:r>
-            <w:r>
-              <w:rPr>
-                <w:rFonts w:eastAsia="Times New Roman" w:cs="Times New Roman"/>
-                <w:color w:val="000000"/>
-                <w:szCs w:val="28"/>
-                <w:lang w:val="ru-RU"/>
-              </w:rPr>
-              <w:t>…….</w:t>
-            </w:r>
-            <w:r>
-              <w:rPr>
-                <w:rFonts w:eastAsia="Times New Roman" w:cs="Times New Roman"/>
-                <w:color w:val="000000"/>
-                <w:szCs w:val="28"/>
-                <w:lang w:val="ru-RU"/>
-              </w:rPr>
-              <w:t>..........</w:t>
-            </w:r>
-            <w:r>
-              <w:rPr>
-                <w:rFonts w:eastAsia="Times New Roman" w:cs="Times New Roman"/>
-                <w:color w:val="000000"/>
-                <w:szCs w:val="28"/>
-                <w:lang w:val="ru-RU"/>
-              </w:rPr>
-              <w:t>...............................</w:t>
+              <w:t>..........................</w:t>
             </w:r>
             <w:r>
               <w:rPr>
@@ -1636,7 +1549,16 @@
                 <w:szCs w:val="28"/>
                 <w:lang w:val="ru-RU"/>
               </w:rPr>
-              <w:t>Нахождение самых эффективных по времени и размеру оптимизаций………………………...</w:t>
+              <w:t>Сжатие размера объектного и исполняемого файлов……..</w:t>
+            </w:r>
+            <w:r>
+              <w:rPr>
+                <w:rFonts w:eastAsia="Times New Roman" w:cs="Times New Roman"/>
+                <w:color w:val="000000"/>
+                <w:szCs w:val="28"/>
+                <w:lang w:val="ru-RU"/>
+              </w:rPr>
+              <w:t>………………………...</w:t>
             </w:r>
             <w:r>
               <w:rPr>
@@ -1711,7 +1633,7 @@
                 <w:szCs w:val="28"/>
                 <w:lang w:val="ru-RU"/>
               </w:rPr>
-              <w:t>22</w:t>
+              <w:t>5</w:t>
             </w:r>
           </w:p>
         </w:tc>
@@ -1822,7 +1744,7 @@
                 <w:szCs w:val="28"/>
                 <w:lang w:val="ru-RU"/>
               </w:rPr>
-              <w:t>24</w:t>
+              <w:t>8</w:t>
             </w:r>
           </w:p>
           <w:p>
@@ -2319,6 +2241,7 @@
       </w:pPr>
       <w:r>
         <w:rPr>
+          <w:noProof/>
           <w:lang w:val="ru-RU" w:eastAsia="ru-RU"/>
         </w:rPr>
         <w:drawing>
@@ -2362,27 +2285,51 @@
       <w:pPr>
         <w:jc w:val="center"/>
         <w:rPr>
+          <w:lang w:val="ru-RU" w:eastAsia="ru-RU"/>
+        </w:rPr>
+      </w:pPr>
+      <w:r>
+        <w:rPr>
+          <w:lang w:val="ru-RU" w:eastAsia="ru-RU"/>
+        </w:rPr>
+        <w:t xml:space="preserve">Рисунок 3.2.1 – программа </w:t>
+      </w:r>
+      <w:r>
+        <w:rPr>
+          <w:lang w:val="ru-RU" w:eastAsia="ru-RU"/>
+        </w:rPr>
+        <w:t>“</w:t>
+      </w:r>
+      <w:r>
+        <w:rPr>
           <w:lang w:eastAsia="ru-RU"/>
         </w:rPr>
-      </w:pPr>
-      <w:r>
-        <w:rPr>
-          <w:lang w:val="ru-RU" w:eastAsia="ru-RU"/>
-        </w:rPr>
-        <w:t xml:space="preserve">Рисунок 3.2.1 – программа </w:t>
+        <w:t>Hello</w:t>
+      </w:r>
+      <w:r>
+        <w:rPr>
+          <w:lang w:val="ru-RU" w:eastAsia="ru-RU"/>
+        </w:rPr>
+        <w:t xml:space="preserve">, </w:t>
       </w:r>
       <w:r>
         <w:rPr>
           <w:lang w:eastAsia="ru-RU"/>
         </w:rPr>
-        <w:t>“Hello, world!”</w:t>
+        <w:t>world</w:t>
+      </w:r>
+      <w:r>
+        <w:rPr>
+          <w:lang w:val="ru-RU" w:eastAsia="ru-RU"/>
+        </w:rPr>
+        <w:t>!”</w:t>
       </w:r>
     </w:p>
     <w:p>
       <w:pPr>
         <w:jc w:val="center"/>
         <w:rPr>
-          <w:lang w:eastAsia="ru-RU"/>
+          <w:lang w:val="ru-RU" w:eastAsia="ru-RU"/>
         </w:rPr>
       </w:pPr>
     </w:p>
@@ -2530,6 +2477,7 @@
       </w:pPr>
       <w:r>
         <w:rPr>
+          <w:noProof/>
           <w:lang w:val="ru-RU" w:eastAsia="ru-RU"/>
         </w:rPr>
         <w:drawing>
@@ -2624,20 +2572,100 @@
     <w:p>
       <w:pPr>
         <w:rPr>
+          <w:lang w:val="ru-RU" w:eastAsia="ru-RU"/>
+        </w:rPr>
+      </w:pPr>
+      <w:r>
+        <w:rPr>
+          <w:lang w:val="ru-RU" w:eastAsia="ru-RU"/>
+        </w:rPr>
+        <w:t xml:space="preserve">Остальные оптимизации по размеру файлов будут произведены с помощью компилятора </w:t>
+      </w:r>
+      <w:r>
+        <w:rPr>
           <w:lang w:eastAsia="ru-RU"/>
         </w:rPr>
-      </w:pPr>
-      <w:r>
-        <w:rPr>
-          <w:lang w:val="ru-RU" w:eastAsia="ru-RU"/>
-        </w:rPr>
-        <w:t xml:space="preserve">Остальные оптимизации по размеру файлов будут произведены с помощью компилятора </w:t>
-      </w:r>
+        <w:t>msvc</w:t>
+      </w:r>
+      <w:r>
+        <w:rPr>
+          <w:lang w:val="ru-RU" w:eastAsia="ru-RU"/>
+        </w:rPr>
+        <w:t xml:space="preserve"> </w:t>
+      </w:r>
+      <w:r>
+        <w:rPr>
+          <w:lang w:val="ru-RU" w:eastAsia="ru-RU"/>
+        </w:rPr>
+        <w:t>в консоли. Команда для компиляции</w:t>
+      </w:r>
+      <w:r>
+        <w:rPr>
+          <w:lang w:val="ru-RU" w:eastAsia="ru-RU"/>
+        </w:rPr>
+        <w:t>:</w:t>
+      </w:r>
+    </w:p>
+    <w:p>
+      <w:pPr>
+        <w:ind w:firstLine="0"/>
+        <w:rPr>
+          <w:lang w:val="ru-RU" w:eastAsia="ru-RU"/>
+        </w:rPr>
+      </w:pPr>
       <w:r>
         <w:rPr>
           <w:lang w:eastAsia="ru-RU"/>
         </w:rPr>
-        <w:t>msvc</w:t>
+        <w:t>cl</w:t>
+      </w:r>
+      <w:r>
+        <w:rPr>
+          <w:lang w:val="ru-RU" w:eastAsia="ru-RU"/>
+        </w:rPr>
+        <w:t xml:space="preserve"> /</w:t>
+      </w:r>
+      <w:r>
+        <w:rPr>
+          <w:lang w:eastAsia="ru-RU"/>
+        </w:rPr>
+        <w:t>O</w:t>
+      </w:r>
+      <w:r>
+        <w:rPr>
+          <w:lang w:val="ru-RU" w:eastAsia="ru-RU"/>
+        </w:rPr>
+        <w:t>1 /</w:t>
+      </w:r>
+      <w:r>
+        <w:rPr>
+          <w:lang w:eastAsia="ru-RU"/>
+        </w:rPr>
+        <w:t>GS</w:t>
+      </w:r>
+      <w:r>
+        <w:rPr>
+          <w:lang w:val="ru-RU" w:eastAsia="ru-RU"/>
+        </w:rPr>
+        <w:t>- /</w:t>
+      </w:r>
+      <w:r>
+        <w:rPr>
+          <w:lang w:eastAsia="ru-RU"/>
+        </w:rPr>
+        <w:t>Zl</w:t>
+      </w:r>
+      <w:r>
+        <w:rPr>
+          <w:lang w:val="ru-RU" w:eastAsia="ru-RU"/>
+        </w:rPr>
+        <w:t xml:space="preserve"> /</w:t>
+      </w:r>
+      <w:r>
+        <w:rPr>
+          <w:lang w:eastAsia="ru-RU"/>
+        </w:rPr>
+        <w:t>c</w:t>
       </w:r>
       <w:r>
         <w:rPr>
@@ -2647,29 +2675,21 @@
       </w:r>
       <w:r>
         <w:rPr>
-          <w:lang w:val="ru-RU" w:eastAsia="ru-RU"/>
-        </w:rPr>
-        <w:t>в консоли. Команда для компиляции</w:t>
-      </w:r>
-      <w:r>
-        <w:rPr>
           <w:lang w:eastAsia="ru-RU"/>
         </w:rPr>
-        <w:t>:</w:t>
-      </w:r>
-    </w:p>
-    <w:p>
-      <w:pPr>
-        <w:ind w:firstLine="0"/>
+        <w:t>helloworld</w:t>
+      </w:r>
+      <w:r>
+        <w:rPr>
+          <w:lang w:val="ru-RU" w:eastAsia="ru-RU"/>
+        </w:rPr>
+        <w:t>.</w:t>
+      </w:r>
+      <w:r>
         <w:rPr>
           <w:lang w:eastAsia="ru-RU"/>
         </w:rPr>
-      </w:pPr>
-      <w:r>
-        <w:rPr>
-          <w:lang w:eastAsia="ru-RU"/>
-        </w:rPr>
-        <w:t>cl /O1 /GS- /Zl /c helloworld.c</w:t>
+        <w:t>c</w:t>
       </w:r>
     </w:p>
     <w:p>
@@ -2889,13 +2909,7 @@
         <w:rPr>
           <w:lang w:eastAsia="ru-RU"/>
         </w:rPr>
-        <w:t xml:space="preserve"> </w:t>
-      </w:r>
-      <w:r>
-        <w:rPr>
-          <w:lang w:eastAsia="ru-RU"/>
-        </w:rPr>
-        <w:t>/MERGE:.rdata=. /MERGE:.pdata=. /MERGE:.text=. /SECTION:.,ER /ALIGN:16</w:t>
+        <w:t xml:space="preserve"> /MERGE:.rdata=. /MERGE:.pdata=. /MERGE:.text=. /SECTION:.,ER /ALIGN:16</w:t>
       </w:r>
       <w:r>
         <w:rPr>
@@ -3021,6 +3035,7 @@
       </w:pPr>
       <w:r>
         <w:rPr>
+          <w:noProof/>
           <w:lang w:val="ru-RU" w:eastAsia="ru-RU"/>
         </w:rPr>
         <w:drawing>
@@ -3089,9 +3104,6 @@
           <w:ilvl w:val="0"/>
           <w:numId w:val="0"/>
         </w:numPr>
-        <w:rPr>
-          <w:lang w:val="en-US"/>
-        </w:rPr>
       </w:pPr>
       <w:r>
         <w:lastRenderedPageBreak/>
@@ -3107,7 +3119,7 @@
       </w:pPr>
       <w:r>
         <w:rPr>
-          <w:lang w:eastAsia="ru-RU"/>
+          <w:lang w:val="ru-RU" w:eastAsia="ru-RU"/>
         </w:rPr>
         <w:tab/>
       </w:r>
@@ -3117,8 +3129,6 @@
         </w:rPr>
         <w:t>Для простых программ на Си совершенно необязательно раздутие исполняемого файла до сотен Кбайт, однако по умолчанию современные компиляторы даже при опции оптимизации по размеру относятся к памяти весьма неэкономно.</w:t>
       </w:r>
-      <w:bookmarkStart w:id="2" w:name="_GoBack"/>
-      <w:bookmarkEnd w:id="2"/>
     </w:p>
     <w:p>
       <w:pPr>
@@ -3270,7 +3280,7 @@
 </file>
 
 <file path=word/endnotes.xml><?xml version="1.0" encoding="utf-8"?>
-<w:endnotes xmlns:wpc="http://schemas.microsoft.com/office/word/2010/wordprocessingCanvas" xmlns:cx="http://schemas.microsoft.com/office/drawing/2014/chartex" xmlns:cx1="http://schemas.microsoft.com/office/drawing/2015/9/8/chartex" xmlns:mc="http://schemas.openxmlformats.org/markup-compatibility/2006" xmlns:o="urn:schemas-microsoft-com:office:office" xmlns:r="http://schemas.openxmlformats.org/officeDocument/2006/relationships" xmlns:m="http://schemas.openxmlformats.org/officeDocument/2006/math" xmlns:v="urn:schemas-microsoft-com:vml" xmlns:wp14="http://schemas.microsoft.com/office/word/2010/wordprocessingDrawing" xmlns:wp="http://schemas.openxmlformats.org/drawingml/2006/wordprocessingDrawing" xmlns:w10="urn:schemas-microsoft-com:office:word" xmlns:w="http://schemas.openxmlformats.org/wordprocessingml/2006/main" xmlns:w14="http://schemas.microsoft.com/office/word/2010/wordml" xmlns:w15="http://schemas.microsoft.com/office/word/2012/wordml" xmlns:w16se="http://schemas.microsoft.com/office/word/2015/wordml/symex" xmlns:wpg="http://schemas.microsoft.com/office/word/2010/wordprocessingGroup" xmlns:wpi="http://schemas.microsoft.com/office/word/2010/wordprocessingInk" xmlns:wne="http://schemas.microsoft.com/office/word/2006/wordml" xmlns:wps="http://schemas.microsoft.com/office/word/2010/wordprocessingShape" mc:Ignorable="w14 w15 w16se wp14">
+<w:endnotes xmlns:wpc="http://schemas.microsoft.com/office/word/2010/wordprocessingCanvas" xmlns:cx="http://schemas.microsoft.com/office/drawing/2014/chartex" xmlns:cx1="http://schemas.microsoft.com/office/drawing/2015/9/8/chartex" xmlns:cx2="http://schemas.microsoft.com/office/drawing/2015/10/21/chartex" xmlns:cx3="http://schemas.microsoft.com/office/drawing/2016/5/9/chartex" xmlns:cx4="http://schemas.microsoft.com/office/drawing/2016/5/10/chartex" xmlns:cx5="http://schemas.microsoft.com/office/drawing/2016/5/11/chartex" xmlns:cx6="http://schemas.microsoft.com/office/drawing/2016/5/12/chartex" xmlns:cx7="http://schemas.microsoft.com/office/drawing/2016/5/13/chartex" xmlns:cx8="http://schemas.microsoft.com/office/drawing/2016/5/14/chartex" xmlns:mc="http://schemas.openxmlformats.org/markup-compatibility/2006" xmlns:aink="http://schemas.microsoft.com/office/drawing/2016/ink" xmlns:am3d="http://schemas.microsoft.com/office/drawing/2017/model3d" xmlns:o="urn:schemas-microsoft-com:office:office" xmlns:r="http://schemas.openxmlformats.org/officeDocument/2006/relationships" xmlns:m="http://schemas.openxmlformats.org/officeDocument/2006/math" xmlns:v="urn:schemas-microsoft-com:vml" xmlns:wp14="http://schemas.microsoft.com/office/word/2010/wordprocessingDrawing" xmlns:wp="http://schemas.openxmlformats.org/drawingml/2006/wordprocessingDrawing" xmlns:w10="urn:schemas-microsoft-com:office:word" xmlns:w="http://schemas.openxmlformats.org/wordprocessingml/2006/main" xmlns:w14="http://schemas.microsoft.com/office/word/2010/wordml" xmlns:w15="http://schemas.microsoft.com/office/word/2012/wordml" xmlns:w16cex="http://schemas.microsoft.com/office/word/2018/wordml/cex" xmlns:w16cid="http://schemas.microsoft.com/office/word/2016/wordml/cid" xmlns:w16="http://schemas.microsoft.com/office/word/2018/wordml" xmlns:w16sdtdh="http://schemas.microsoft.com/office/word/2020/wordml/sdtdatahash" xmlns:w16se="http://schemas.microsoft.com/office/word/2015/wordml/symex" xmlns:wpg="http://schemas.microsoft.com/office/word/2010/wordprocessingGroup" xmlns:wpi="http://schemas.microsoft.com/office/word/2010/wordprocessingInk" xmlns:wne="http://schemas.microsoft.com/office/word/2006/wordml" xmlns:wps="http://schemas.microsoft.com/office/word/2010/wordprocessingShape" mc:Ignorable="w14 w15 w16se w16cid w16 w16cex w16sdtdh wp14">
   <w:endnote w:type="separator" w:id="-1">
     <w:p>
       <w:pPr>
@@ -3295,7 +3305,7 @@
 </file>
 
 <file path=word/footer1.xml><?xml version="1.0" encoding="utf-8"?>
-<w:ftr xmlns:wpc="http://schemas.microsoft.com/office/word/2010/wordprocessingCanvas" xmlns:cx="http://schemas.microsoft.com/office/drawing/2014/chartex" xmlns:cx1="http://schemas.microsoft.com/office/drawing/2015/9/8/chartex" xmlns:mc="http://schemas.openxmlformats.org/markup-compatibility/2006" xmlns:o="urn:schemas-microsoft-com:office:office" xmlns:r="http://schemas.openxmlformats.org/officeDocument/2006/relationships" xmlns:m="http://schemas.openxmlformats.org/officeDocument/2006/math" xmlns:v="urn:schemas-microsoft-com:vml" xmlns:wp14="http://schemas.microsoft.com/office/word/2010/wordprocessingDrawing" xmlns:wp="http://schemas.openxmlformats.org/drawingml/2006/wordprocessingDrawing" xmlns:w10="urn:schemas-microsoft-com:office:word" xmlns:w="http://schemas.openxmlformats.org/wordprocessingml/2006/main" xmlns:w14="http://schemas.microsoft.com/office/word/2010/wordml" xmlns:w15="http://schemas.microsoft.com/office/word/2012/wordml" xmlns:w16se="http://schemas.microsoft.com/office/word/2015/wordml/symex" xmlns:wpg="http://schemas.microsoft.com/office/word/2010/wordprocessingGroup" xmlns:wpi="http://schemas.microsoft.com/office/word/2010/wordprocessingInk" xmlns:wne="http://schemas.microsoft.com/office/word/2006/wordml" xmlns:wps="http://schemas.microsoft.com/office/word/2010/wordprocessingShape" mc:Ignorable="w14 w15 w16se wp14">
+<w:ftr xmlns:wpc="http://schemas.microsoft.com/office/word/2010/wordprocessingCanvas" xmlns:cx="http://schemas.microsoft.com/office/drawing/2014/chartex" xmlns:cx1="http://schemas.microsoft.com/office/drawing/2015/9/8/chartex" xmlns:cx2="http://schemas.microsoft.com/office/drawing/2015/10/21/chartex" xmlns:cx3="http://schemas.microsoft.com/office/drawing/2016/5/9/chartex" xmlns:cx4="http://schemas.microsoft.com/office/drawing/2016/5/10/chartex" xmlns:cx5="http://schemas.microsoft.com/office/drawing/2016/5/11/chartex" xmlns:cx6="http://schemas.microsoft.com/office/drawing/2016/5/12/chartex" xmlns:cx7="http://schemas.microsoft.com/office/drawing/2016/5/13/chartex" xmlns:cx8="http://schemas.microsoft.com/office/drawing/2016/5/14/chartex" xmlns:mc="http://schemas.openxmlformats.org/markup-compatibility/2006" xmlns:aink="http://schemas.microsoft.com/office/drawing/2016/ink" xmlns:am3d="http://schemas.microsoft.com/office/drawing/2017/model3d" xmlns:o="urn:schemas-microsoft-com:office:office" xmlns:r="http://schemas.openxmlformats.org/officeDocument/2006/relationships" xmlns:m="http://schemas.openxmlformats.org/officeDocument/2006/math" xmlns:v="urn:schemas-microsoft-com:vml" xmlns:wp14="http://schemas.microsoft.com/office/word/2010/wordprocessingDrawing" xmlns:wp="http://schemas.openxmlformats.org/drawingml/2006/wordprocessingDrawing" xmlns:w10="urn:schemas-microsoft-com:office:word" xmlns:w="http://schemas.openxmlformats.org/wordprocessingml/2006/main" xmlns:w14="http://schemas.microsoft.com/office/word/2010/wordml" xmlns:w15="http://schemas.microsoft.com/office/word/2012/wordml" xmlns:w16cex="http://schemas.microsoft.com/office/word/2018/wordml/cex" xmlns:w16cid="http://schemas.microsoft.com/office/word/2016/wordml/cid" xmlns:w16="http://schemas.microsoft.com/office/word/2018/wordml" xmlns:w16sdtdh="http://schemas.microsoft.com/office/word/2020/wordml/sdtdatahash" xmlns:w16se="http://schemas.microsoft.com/office/word/2015/wordml/symex" xmlns:wpg="http://schemas.microsoft.com/office/word/2010/wordprocessingGroup" xmlns:wpi="http://schemas.microsoft.com/office/word/2010/wordprocessingInk" xmlns:wne="http://schemas.microsoft.com/office/word/2006/wordml" xmlns:wps="http://schemas.microsoft.com/office/word/2010/wordprocessingShape" mc:Ignorable="w14 w15 w16se w16cid w16 w16cex w16sdtdh wp14">
   <w:sdt>
     <w:sdtPr>
       <w:rPr>
@@ -3352,7 +3362,7 @@
 </file>
 
 <file path=word/footer2.xml><?xml version="1.0" encoding="utf-8"?>
-<w:ftr xmlns:wpc="http://schemas.microsoft.com/office/word/2010/wordprocessingCanvas" xmlns:cx="http://schemas.microsoft.com/office/drawing/2014/chartex" xmlns:cx1="http://schemas.microsoft.com/office/drawing/2015/9/8/chartex" xmlns:mc="http://schemas.openxmlformats.org/markup-compatibility/2006" xmlns:o="urn:schemas-microsoft-com:office:office" xmlns:r="http://schemas.openxmlformats.org/officeDocument/2006/relationships" xmlns:m="http://schemas.openxmlformats.org/officeDocument/2006/math" xmlns:v="urn:schemas-microsoft-com:vml" xmlns:wp14="http://schemas.microsoft.com/office/word/2010/wordprocessingDrawing" xmlns:wp="http://schemas.openxmlformats.org/drawingml/2006/wordprocessingDrawing" xmlns:w10="urn:schemas-microsoft-com:office:word" xmlns:w="http://schemas.openxmlformats.org/wordprocessingml/2006/main" xmlns:w14="http://schemas.microsoft.com/office/word/2010/wordml" xmlns:w15="http://schemas.microsoft.com/office/word/2012/wordml" xmlns:w16se="http://schemas.microsoft.com/office/word/2015/wordml/symex" xmlns:wpg="http://schemas.microsoft.com/office/word/2010/wordprocessingGroup" xmlns:wpi="http://schemas.microsoft.com/office/word/2010/wordprocessingInk" xmlns:wne="http://schemas.microsoft.com/office/word/2006/wordml" xmlns:wps="http://schemas.microsoft.com/office/word/2010/wordprocessingShape" mc:Ignorable="w14 w15 w16se wp14">
+<w:ftr xmlns:wpc="http://schemas.microsoft.com/office/word/2010/wordprocessingCanvas" xmlns:cx="http://schemas.microsoft.com/office/drawing/2014/chartex" xmlns:cx1="http://schemas.microsoft.com/office/drawing/2015/9/8/chartex" xmlns:cx2="http://schemas.microsoft.com/office/drawing/2015/10/21/chartex" xmlns:cx3="http://schemas.microsoft.com/office/drawing/2016/5/9/chartex" xmlns:cx4="http://schemas.microsoft.com/office/drawing/2016/5/10/chartex" xmlns:cx5="http://schemas.microsoft.com/office/drawing/2016/5/11/chartex" xmlns:cx6="http://schemas.microsoft.com/office/drawing/2016/5/12/chartex" xmlns:cx7="http://schemas.microsoft.com/office/drawing/2016/5/13/chartex" xmlns:cx8="http://schemas.microsoft.com/office/drawing/2016/5/14/chartex" xmlns:mc="http://schemas.openxmlformats.org/markup-compatibility/2006" xmlns:aink="http://schemas.microsoft.com/office/drawing/2016/ink" xmlns:am3d="http://schemas.microsoft.com/office/drawing/2017/model3d" xmlns:o="urn:schemas-microsoft-com:office:office" xmlns:r="http://schemas.openxmlformats.org/officeDocument/2006/relationships" xmlns:m="http://schemas.openxmlformats.org/officeDocument/2006/math" xmlns:v="urn:schemas-microsoft-com:vml" xmlns:wp14="http://schemas.microsoft.com/office/word/2010/wordprocessingDrawing" xmlns:wp="http://schemas.openxmlformats.org/drawingml/2006/wordprocessingDrawing" xmlns:w10="urn:schemas-microsoft-com:office:word" xmlns:w="http://schemas.openxmlformats.org/wordprocessingml/2006/main" xmlns:w14="http://schemas.microsoft.com/office/word/2010/wordml" xmlns:w15="http://schemas.microsoft.com/office/word/2012/wordml" xmlns:w16cex="http://schemas.microsoft.com/office/word/2018/wordml/cex" xmlns:w16cid="http://schemas.microsoft.com/office/word/2016/wordml/cid" xmlns:w16="http://schemas.microsoft.com/office/word/2018/wordml" xmlns:w16sdtdh="http://schemas.microsoft.com/office/word/2020/wordml/sdtdatahash" xmlns:w16se="http://schemas.microsoft.com/office/word/2015/wordml/symex" xmlns:wpg="http://schemas.microsoft.com/office/word/2010/wordprocessingGroup" xmlns:wpi="http://schemas.microsoft.com/office/word/2010/wordprocessingInk" xmlns:wne="http://schemas.microsoft.com/office/word/2006/wordml" xmlns:wps="http://schemas.microsoft.com/office/word/2010/wordprocessingShape" mc:Ignorable="w14 w15 w16se w16cid w16 w16cex w16sdtdh wp14">
   <w:p>
     <w:pPr>
       <w:pStyle w:val="a9"/>
@@ -3363,7 +3373,7 @@
 </file>
 
 <file path=word/footer3.xml><?xml version="1.0" encoding="utf-8"?>
-<w:ftr xmlns:wpc="http://schemas.microsoft.com/office/word/2010/wordprocessingCanvas" xmlns:cx="http://schemas.microsoft.com/office/drawing/2014/chartex" xmlns:cx1="http://schemas.microsoft.com/office/drawing/2015/9/8/chartex" xmlns:mc="http://schemas.openxmlformats.org/markup-compatibility/2006" xmlns:o="urn:schemas-microsoft-com:office:office" xmlns:r="http://schemas.openxmlformats.org/officeDocument/2006/relationships" xmlns:m="http://schemas.openxmlformats.org/officeDocument/2006/math" xmlns:v="urn:schemas-microsoft-com:vml" xmlns:wp14="http://schemas.microsoft.com/office/word/2010/wordprocessingDrawing" xmlns:wp="http://schemas.openxmlformats.org/drawingml/2006/wordprocessingDrawing" xmlns:w10="urn:schemas-microsoft-com:office:word" xmlns:w="http://schemas.openxmlformats.org/wordprocessingml/2006/main" xmlns:w14="http://schemas.microsoft.com/office/word/2010/wordml" xmlns:w15="http://schemas.microsoft.com/office/word/2012/wordml" xmlns:w16se="http://schemas.microsoft.com/office/word/2015/wordml/symex" xmlns:wpg="http://schemas.microsoft.com/office/word/2010/wordprocessingGroup" xmlns:wpi="http://schemas.microsoft.com/office/word/2010/wordprocessingInk" xmlns:wne="http://schemas.microsoft.com/office/word/2006/wordml" xmlns:wps="http://schemas.microsoft.com/office/word/2010/wordprocessingShape" mc:Ignorable="w14 w15 w16se wp14">
+<w:ftr xmlns:wpc="http://schemas.microsoft.com/office/word/2010/wordprocessingCanvas" xmlns:cx="http://schemas.microsoft.com/office/drawing/2014/chartex" xmlns:cx1="http://schemas.microsoft.com/office/drawing/2015/9/8/chartex" xmlns:cx2="http://schemas.microsoft.com/office/drawing/2015/10/21/chartex" xmlns:cx3="http://schemas.microsoft.com/office/drawing/2016/5/9/chartex" xmlns:cx4="http://schemas.microsoft.com/office/drawing/2016/5/10/chartex" xmlns:cx5="http://schemas.microsoft.com/office/drawing/2016/5/11/chartex" xmlns:cx6="http://schemas.microsoft.com/office/drawing/2016/5/12/chartex" xmlns:cx7="http://schemas.microsoft.com/office/drawing/2016/5/13/chartex" xmlns:cx8="http://schemas.microsoft.com/office/drawing/2016/5/14/chartex" xmlns:mc="http://schemas.openxmlformats.org/markup-compatibility/2006" xmlns:aink="http://schemas.microsoft.com/office/drawing/2016/ink" xmlns:am3d="http://schemas.microsoft.com/office/drawing/2017/model3d" xmlns:o="urn:schemas-microsoft-com:office:office" xmlns:r="http://schemas.openxmlformats.org/officeDocument/2006/relationships" xmlns:m="http://schemas.openxmlformats.org/officeDocument/2006/math" xmlns:v="urn:schemas-microsoft-com:vml" xmlns:wp14="http://schemas.microsoft.com/office/word/2010/wordprocessingDrawing" xmlns:wp="http://schemas.openxmlformats.org/drawingml/2006/wordprocessingDrawing" xmlns:w10="urn:schemas-microsoft-com:office:word" xmlns:w="http://schemas.openxmlformats.org/wordprocessingml/2006/main" xmlns:w14="http://schemas.microsoft.com/office/word/2010/wordml" xmlns:w15="http://schemas.microsoft.com/office/word/2012/wordml" xmlns:w16cex="http://schemas.microsoft.com/office/word/2018/wordml/cex" xmlns:w16cid="http://schemas.microsoft.com/office/word/2016/wordml/cid" xmlns:w16="http://schemas.microsoft.com/office/word/2018/wordml" xmlns:w16sdtdh="http://schemas.microsoft.com/office/word/2020/wordml/sdtdatahash" xmlns:w16se="http://schemas.microsoft.com/office/word/2015/wordml/symex" xmlns:wpg="http://schemas.microsoft.com/office/word/2010/wordprocessingGroup" xmlns:wpi="http://schemas.microsoft.com/office/word/2010/wordprocessingInk" xmlns:wne="http://schemas.microsoft.com/office/word/2006/wordml" xmlns:wps="http://schemas.microsoft.com/office/word/2010/wordprocessingShape" mc:Ignorable="w14 w15 w16se w16cid w16 w16cex w16sdtdh wp14">
   <w:p>
     <w:pPr>
       <w:pStyle w:val="a9"/>
@@ -3374,7 +3384,7 @@
 </file>
 
 <file path=word/footnotes.xml><?xml version="1.0" encoding="utf-8"?>
-<w:footnotes xmlns:wpc="http://schemas.microsoft.com/office/word/2010/wordprocessingCanvas" xmlns:cx="http://schemas.microsoft.com/office/drawing/2014/chartex" xmlns:cx1="http://schemas.microsoft.com/office/drawing/2015/9/8/chartex" xmlns:mc="http://schemas.openxmlformats.org/markup-compatibility/2006" xmlns:o="urn:schemas-microsoft-com:office:office" xmlns:r="http://schemas.openxmlformats.org/officeDocument/2006/relationships" xmlns:m="http://schemas.openxmlformats.org/officeDocument/2006/math" xmlns:v="urn:schemas-microsoft-com:vml" xmlns:wp14="http://schemas.microsoft.com/office/word/2010/wordprocessingDrawing" xmlns:wp="http://schemas.openxmlformats.org/drawingml/2006/wordprocessingDrawing" xmlns:w10="urn:schemas-microsoft-com:office:word" xmlns:w="http://schemas.openxmlformats.org/wordprocessingml/2006/main" xmlns:w14="http://schemas.microsoft.com/office/word/2010/wordml" xmlns:w15="http://schemas.microsoft.com/office/word/2012/wordml" xmlns:w16se="http://schemas.microsoft.com/office/word/2015/wordml/symex" xmlns:wpg="http://schemas.microsoft.com/office/word/2010/wordprocessingGroup" xmlns:wpi="http://schemas.microsoft.com/office/word/2010/wordprocessingInk" xmlns:wne="http://schemas.microsoft.com/office/word/2006/wordml" xmlns:wps="http://schemas.microsoft.com/office/word/2010/wordprocessingShape" mc:Ignorable="w14 w15 w16se wp14">
+<w:footnotes xmlns:wpc="http://schemas.microsoft.com/office/word/2010/wordprocessingCanvas" xmlns:cx="http://schemas.microsoft.com/office/drawing/2014/chartex" xmlns:cx1="http://schemas.microsoft.com/office/drawing/2015/9/8/chartex" xmlns:cx2="http://schemas.microsoft.com/office/drawing/2015/10/21/chartex" xmlns:cx3="http://schemas.microsoft.com/office/drawing/2016/5/9/chartex" xmlns:cx4="http://schemas.microsoft.com/office/drawing/2016/5/10/chartex" xmlns:cx5="http://schemas.microsoft.com/office/drawing/2016/5/11/chartex" xmlns:cx6="http://schemas.microsoft.com/office/drawing/2016/5/12/chartex" xmlns:cx7="http://schemas.microsoft.com/office/drawing/2016/5/13/chartex" xmlns:cx8="http://schemas.microsoft.com/office/drawing/2016/5/14/chartex" xmlns:mc="http://schemas.openxmlformats.org/markup-compatibility/2006" xmlns:aink="http://schemas.microsoft.com/office/drawing/2016/ink" xmlns:am3d="http://schemas.microsoft.com/office/drawing/2017/model3d" xmlns:o="urn:schemas-microsoft-com:office:office" xmlns:r="http://schemas.openxmlformats.org/officeDocument/2006/relationships" xmlns:m="http://schemas.openxmlformats.org/officeDocument/2006/math" xmlns:v="urn:schemas-microsoft-com:vml" xmlns:wp14="http://schemas.microsoft.com/office/word/2010/wordprocessingDrawing" xmlns:wp="http://schemas.openxmlformats.org/drawingml/2006/wordprocessingDrawing" xmlns:w10="urn:schemas-microsoft-com:office:word" xmlns:w="http://schemas.openxmlformats.org/wordprocessingml/2006/main" xmlns:w14="http://schemas.microsoft.com/office/word/2010/wordml" xmlns:w15="http://schemas.microsoft.com/office/word/2012/wordml" xmlns:w16cex="http://schemas.microsoft.com/office/word/2018/wordml/cex" xmlns:w16cid="http://schemas.microsoft.com/office/word/2016/wordml/cid" xmlns:w16="http://schemas.microsoft.com/office/word/2018/wordml" xmlns:w16sdtdh="http://schemas.microsoft.com/office/word/2020/wordml/sdtdatahash" xmlns:w16se="http://schemas.microsoft.com/office/word/2015/wordml/symex" xmlns:wpg="http://schemas.microsoft.com/office/word/2010/wordprocessingGroup" xmlns:wpi="http://schemas.microsoft.com/office/word/2010/wordprocessingInk" xmlns:wne="http://schemas.microsoft.com/office/word/2006/wordml" xmlns:wps="http://schemas.microsoft.com/office/word/2010/wordprocessingShape" mc:Ignorable="w14 w15 w16se w16cid w16 w16cex w16sdtdh wp14">
   <w:footnote w:type="separator" w:id="-1">
     <w:p>
       <w:pPr>
@@ -3399,7 +3409,7 @@
 </file>
 
 <file path=word/header1.xml><?xml version="1.0" encoding="utf-8"?>
-<w:hdr xmlns:wpc="http://schemas.microsoft.com/office/word/2010/wordprocessingCanvas" xmlns:cx="http://schemas.microsoft.com/office/drawing/2014/chartex" xmlns:cx1="http://schemas.microsoft.com/office/drawing/2015/9/8/chartex" xmlns:mc="http://schemas.openxmlformats.org/markup-compatibility/2006" xmlns:o="urn:schemas-microsoft-com:office:office" xmlns:r="http://schemas.openxmlformats.org/officeDocument/2006/relationships" xmlns:m="http://schemas.openxmlformats.org/officeDocument/2006/math" xmlns:v="urn:schemas-microsoft-com:vml" xmlns:wp14="http://schemas.microsoft.com/office/word/2010/wordprocessingDrawing" xmlns:wp="http://schemas.openxmlformats.org/drawingml/2006/wordprocessingDrawing" xmlns:w10="urn:schemas-microsoft-com:office:word" xmlns:w="http://schemas.openxmlformats.org/wordprocessingml/2006/main" xmlns:w14="http://schemas.microsoft.com/office/word/2010/wordml" xmlns:w15="http://schemas.microsoft.com/office/word/2012/wordml" xmlns:w16se="http://schemas.microsoft.com/office/word/2015/wordml/symex" xmlns:wpg="http://schemas.microsoft.com/office/word/2010/wordprocessingGroup" xmlns:wpi="http://schemas.microsoft.com/office/word/2010/wordprocessingInk" xmlns:wne="http://schemas.microsoft.com/office/word/2006/wordml" xmlns:wps="http://schemas.microsoft.com/office/word/2010/wordprocessingShape" mc:Ignorable="w14 w15 w16se wp14">
+<w:hdr xmlns:wpc="http://schemas.microsoft.com/office/word/2010/wordprocessingCanvas" xmlns:cx="http://schemas.microsoft.com/office/drawing/2014/chartex" xmlns:cx1="http://schemas.microsoft.com/office/drawing/2015/9/8/chartex" xmlns:cx2="http://schemas.microsoft.com/office/drawing/2015/10/21/chartex" xmlns:cx3="http://schemas.microsoft.com/office/drawing/2016/5/9/chartex" xmlns:cx4="http://schemas.microsoft.com/office/drawing/2016/5/10/chartex" xmlns:cx5="http://schemas.microsoft.com/office/drawing/2016/5/11/chartex" xmlns:cx6="http://schemas.microsoft.com/office/drawing/2016/5/12/chartex" xmlns:cx7="http://schemas.microsoft.com/office/drawing/2016/5/13/chartex" xmlns:cx8="http://schemas.microsoft.com/office/drawing/2016/5/14/chartex" xmlns:mc="http://schemas.openxmlformats.org/markup-compatibility/2006" xmlns:aink="http://schemas.microsoft.com/office/drawing/2016/ink" xmlns:am3d="http://schemas.microsoft.com/office/drawing/2017/model3d" xmlns:o="urn:schemas-microsoft-com:office:office" xmlns:r="http://schemas.openxmlformats.org/officeDocument/2006/relationships" xmlns:m="http://schemas.openxmlformats.org/officeDocument/2006/math" xmlns:v="urn:schemas-microsoft-com:vml" xmlns:wp14="http://schemas.microsoft.com/office/word/2010/wordprocessingDrawing" xmlns:wp="http://schemas.openxmlformats.org/drawingml/2006/wordprocessingDrawing" xmlns:w10="urn:schemas-microsoft-com:office:word" xmlns:w="http://schemas.openxmlformats.org/wordprocessingml/2006/main" xmlns:w14="http://schemas.microsoft.com/office/word/2010/wordml" xmlns:w15="http://schemas.microsoft.com/office/word/2012/wordml" xmlns:w16cex="http://schemas.microsoft.com/office/word/2018/wordml/cex" xmlns:w16cid="http://schemas.microsoft.com/office/word/2016/wordml/cid" xmlns:w16="http://schemas.microsoft.com/office/word/2018/wordml" xmlns:w16sdtdh="http://schemas.microsoft.com/office/word/2020/wordml/sdtdatahash" xmlns:w16se="http://schemas.microsoft.com/office/word/2015/wordml/symex" xmlns:wpg="http://schemas.microsoft.com/office/word/2010/wordprocessingGroup" xmlns:wpi="http://schemas.microsoft.com/office/word/2010/wordprocessingInk" xmlns:wne="http://schemas.microsoft.com/office/word/2006/wordml" xmlns:wps="http://schemas.microsoft.com/office/word/2010/wordprocessingShape" mc:Ignorable="w14 w15 w16se w16cid w16 w16cex w16sdtdh wp14">
   <w:sdt>
     <w:sdtPr>
       <w:rPr>
@@ -3503,7 +3513,7 @@
 </file>
 
 <file path=word/header2.xml><?xml version="1.0" encoding="utf-8"?>
-<w:hdr xmlns:wpc="http://schemas.microsoft.com/office/word/2010/wordprocessingCanvas" xmlns:cx="http://schemas.microsoft.com/office/drawing/2014/chartex" xmlns:cx1="http://schemas.microsoft.com/office/drawing/2015/9/8/chartex" xmlns:mc="http://schemas.openxmlformats.org/markup-compatibility/2006" xmlns:o="urn:schemas-microsoft-com:office:office" xmlns:r="http://schemas.openxmlformats.org/officeDocument/2006/relationships" xmlns:m="http://schemas.openxmlformats.org/officeDocument/2006/math" xmlns:v="urn:schemas-microsoft-com:vml" xmlns:wp14="http://schemas.microsoft.com/office/word/2010/wordprocessingDrawing" xmlns:wp="http://schemas.openxmlformats.org/drawingml/2006/wordprocessingDrawing" xmlns:w10="urn:schemas-microsoft-com:office:word" xmlns:w="http://schemas.openxmlformats.org/wordprocessingml/2006/main" xmlns:w14="http://schemas.microsoft.com/office/word/2010/wordml" xmlns:w15="http://schemas.microsoft.com/office/word/2012/wordml" xmlns:w16se="http://schemas.microsoft.com/office/word/2015/wordml/symex" xmlns:wpg="http://schemas.microsoft.com/office/word/2010/wordprocessingGroup" xmlns:wpi="http://schemas.microsoft.com/office/word/2010/wordprocessingInk" xmlns:wne="http://schemas.microsoft.com/office/word/2006/wordml" xmlns:wps="http://schemas.microsoft.com/office/word/2010/wordprocessingShape" mc:Ignorable="w14 w15 w16se wp14">
+<w:hdr xmlns:wpc="http://schemas.microsoft.com/office/word/2010/wordprocessingCanvas" xmlns:cx="http://schemas.microsoft.com/office/drawing/2014/chartex" xmlns:cx1="http://schemas.microsoft.com/office/drawing/2015/9/8/chartex" xmlns:cx2="http://schemas.microsoft.com/office/drawing/2015/10/21/chartex" xmlns:cx3="http://schemas.microsoft.com/office/drawing/2016/5/9/chartex" xmlns:cx4="http://schemas.microsoft.com/office/drawing/2016/5/10/chartex" xmlns:cx5="http://schemas.microsoft.com/office/drawing/2016/5/11/chartex" xmlns:cx6="http://schemas.microsoft.com/office/drawing/2016/5/12/chartex" xmlns:cx7="http://schemas.microsoft.com/office/drawing/2016/5/13/chartex" xmlns:cx8="http://schemas.microsoft.com/office/drawing/2016/5/14/chartex" xmlns:mc="http://schemas.openxmlformats.org/markup-compatibility/2006" xmlns:aink="http://schemas.microsoft.com/office/drawing/2016/ink" xmlns:am3d="http://schemas.microsoft.com/office/drawing/2017/model3d" xmlns:o="urn:schemas-microsoft-com:office:office" xmlns:r="http://schemas.openxmlformats.org/officeDocument/2006/relationships" xmlns:m="http://schemas.openxmlformats.org/officeDocument/2006/math" xmlns:v="urn:schemas-microsoft-com:vml" xmlns:wp14="http://schemas.microsoft.com/office/word/2010/wordprocessingDrawing" xmlns:wp="http://schemas.openxmlformats.org/drawingml/2006/wordprocessingDrawing" xmlns:w10="urn:schemas-microsoft-com:office:word" xmlns:w="http://schemas.openxmlformats.org/wordprocessingml/2006/main" xmlns:w14="http://schemas.microsoft.com/office/word/2010/wordml" xmlns:w15="http://schemas.microsoft.com/office/word/2012/wordml" xmlns:w16cex="http://schemas.microsoft.com/office/word/2018/wordml/cex" xmlns:w16cid="http://schemas.microsoft.com/office/word/2016/wordml/cid" xmlns:w16="http://schemas.microsoft.com/office/word/2018/wordml" xmlns:w16sdtdh="http://schemas.microsoft.com/office/word/2020/wordml/sdtdatahash" xmlns:w16se="http://schemas.microsoft.com/office/word/2015/wordml/symex" xmlns:wpg="http://schemas.microsoft.com/office/word/2010/wordprocessingGroup" xmlns:wpi="http://schemas.microsoft.com/office/word/2010/wordprocessingInk" xmlns:wne="http://schemas.microsoft.com/office/word/2006/wordml" xmlns:wps="http://schemas.microsoft.com/office/word/2010/wordprocessingShape" mc:Ignorable="w14 w15 w16se w16cid w16 w16cex w16sdtdh wp14">
   <w:p>
     <w:pPr>
       <w:pStyle w:val="a7"/>
@@ -3515,7 +3525,7 @@
 </file>
 
 <file path=word/header3.xml><?xml version="1.0" encoding="utf-8"?>
-<w:hdr xmlns:wpc="http://schemas.microsoft.com/office/word/2010/wordprocessingCanvas" xmlns:cx="http://schemas.microsoft.com/office/drawing/2014/chartex" xmlns:cx1="http://schemas.microsoft.com/office/drawing/2015/9/8/chartex" xmlns:mc="http://schemas.openxmlformats.org/markup-compatibility/2006" xmlns:o="urn:schemas-microsoft-com:office:office" xmlns:r="http://schemas.openxmlformats.org/officeDocument/2006/relationships" xmlns:m="http://schemas.openxmlformats.org/officeDocument/2006/math" xmlns:v="urn:schemas-microsoft-com:vml" xmlns:wp14="http://schemas.microsoft.com/office/word/2010/wordprocessingDrawing" xmlns:wp="http://schemas.openxmlformats.org/drawingml/2006/wordprocessingDrawing" xmlns:w10="urn:schemas-microsoft-com:office:word" xmlns:w="http://schemas.openxmlformats.org/wordprocessingml/2006/main" xmlns:w14="http://schemas.microsoft.com/office/word/2010/wordml" xmlns:w15="http://schemas.microsoft.com/office/word/2012/wordml" xmlns:w16se="http://schemas.microsoft.com/office/word/2015/wordml/symex" xmlns:wpg="http://schemas.microsoft.com/office/word/2010/wordprocessingGroup" xmlns:wpi="http://schemas.microsoft.com/office/word/2010/wordprocessingInk" xmlns:wne="http://schemas.microsoft.com/office/word/2006/wordml" xmlns:wps="http://schemas.microsoft.com/office/word/2010/wordprocessingShape" mc:Ignorable="w14 w15 w16se wp14">
+<w:hdr xmlns:wpc="http://schemas.microsoft.com/office/word/2010/wordprocessingCanvas" xmlns:cx="http://schemas.microsoft.com/office/drawing/2014/chartex" xmlns:cx1="http://schemas.microsoft.com/office/drawing/2015/9/8/chartex" xmlns:cx2="http://schemas.microsoft.com/office/drawing/2015/10/21/chartex" xmlns:cx3="http://schemas.microsoft.com/office/drawing/2016/5/9/chartex" xmlns:cx4="http://schemas.microsoft.com/office/drawing/2016/5/10/chartex" xmlns:cx5="http://schemas.microsoft.com/office/drawing/2016/5/11/chartex" xmlns:cx6="http://schemas.microsoft.com/office/drawing/2016/5/12/chartex" xmlns:cx7="http://schemas.microsoft.com/office/drawing/2016/5/13/chartex" xmlns:cx8="http://schemas.microsoft.com/office/drawing/2016/5/14/chartex" xmlns:mc="http://schemas.openxmlformats.org/markup-compatibility/2006" xmlns:aink="http://schemas.microsoft.com/office/drawing/2016/ink" xmlns:am3d="http://schemas.microsoft.com/office/drawing/2017/model3d" xmlns:o="urn:schemas-microsoft-com:office:office" xmlns:r="http://schemas.openxmlformats.org/officeDocument/2006/relationships" xmlns:m="http://schemas.openxmlformats.org/officeDocument/2006/math" xmlns:v="urn:schemas-microsoft-com:vml" xmlns:wp14="http://schemas.microsoft.com/office/word/2010/wordprocessingDrawing" xmlns:wp="http://schemas.openxmlformats.org/drawingml/2006/wordprocessingDrawing" xmlns:w10="urn:schemas-microsoft-com:office:word" xmlns:w="http://schemas.openxmlformats.org/wordprocessingml/2006/main" xmlns:w14="http://schemas.microsoft.com/office/word/2010/wordml" xmlns:w15="http://schemas.microsoft.com/office/word/2012/wordml" xmlns:w16cex="http://schemas.microsoft.com/office/word/2018/wordml/cex" xmlns:w16cid="http://schemas.microsoft.com/office/word/2016/wordml/cid" xmlns:w16="http://schemas.microsoft.com/office/word/2018/wordml" xmlns:w16sdtdh="http://schemas.microsoft.com/office/word/2020/wordml/sdtdatahash" xmlns:w16se="http://schemas.microsoft.com/office/word/2015/wordml/symex" xmlns:wpg="http://schemas.microsoft.com/office/word/2010/wordprocessingGroup" xmlns:wpi="http://schemas.microsoft.com/office/word/2010/wordprocessingInk" xmlns:wne="http://schemas.microsoft.com/office/word/2006/wordml" xmlns:wps="http://schemas.microsoft.com/office/word/2010/wordprocessingShape" mc:Ignorable="w14 w15 w16se w16cid w16 w16cex w16sdtdh wp14">
   <w:sdt>
     <w:sdtPr>
       <w:rPr>
@@ -3585,7 +3595,7 @@
 </file>
 
 <file path=word/numbering.xml><?xml version="1.0" encoding="utf-8"?>
-<w:numbering xmlns:wpc="http://schemas.microsoft.com/office/word/2010/wordprocessingCanvas" xmlns:cx="http://schemas.microsoft.com/office/drawing/2014/chartex" xmlns:cx1="http://schemas.microsoft.com/office/drawing/2015/9/8/chartex" xmlns:mc="http://schemas.openxmlformats.org/markup-compatibility/2006" xmlns:o="urn:schemas-microsoft-com:office:office" xmlns:r="http://schemas.openxmlformats.org/officeDocument/2006/relationships" xmlns:m="http://schemas.openxmlformats.org/officeDocument/2006/math" xmlns:v="urn:schemas-microsoft-com:vml" xmlns:wp14="http://schemas.microsoft.com/office/word/2010/wordprocessingDrawing" xmlns:wp="http://schemas.openxmlformats.org/drawingml/2006/wordprocessingDrawing" xmlns:w10="urn:schemas-microsoft-com:office:word" xmlns:w="http://schemas.openxmlformats.org/wordprocessingml/2006/main" xmlns:w14="http://schemas.microsoft.com/office/word/2010/wordml" xmlns:w15="http://schemas.microsoft.com/office/word/2012/wordml" xmlns:w16se="http://schemas.microsoft.com/office/word/2015/wordml/symex" xmlns:wpg="http://schemas.microsoft.com/office/word/2010/wordprocessingGroup" xmlns:wpi="http://schemas.microsoft.com/office/word/2010/wordprocessingInk" xmlns:wne="http://schemas.microsoft.com/office/word/2006/wordml" xmlns:wps="http://schemas.microsoft.com/office/word/2010/wordprocessingShape" mc:Ignorable="w14 w15 w16se wp14">
+<w:numbering xmlns:wpc="http://schemas.microsoft.com/office/word/2010/wordprocessingCanvas" xmlns:cx="http://schemas.microsoft.com/office/drawing/2014/chartex" xmlns:cx1="http://schemas.microsoft.com/office/drawing/2015/9/8/chartex" xmlns:cx2="http://schemas.microsoft.com/office/drawing/2015/10/21/chartex" xmlns:cx3="http://schemas.microsoft.com/office/drawing/2016/5/9/chartex" xmlns:cx4="http://schemas.microsoft.com/office/drawing/2016/5/10/chartex" xmlns:cx5="http://schemas.microsoft.com/office/drawing/2016/5/11/chartex" xmlns:cx6="http://schemas.microsoft.com/office/drawing/2016/5/12/chartex" xmlns:cx7="http://schemas.microsoft.com/office/drawing/2016/5/13/chartex" xmlns:cx8="http://schemas.microsoft.com/office/drawing/2016/5/14/chartex" xmlns:mc="http://schemas.openxmlformats.org/markup-compatibility/2006" xmlns:aink="http://schemas.microsoft.com/office/drawing/2016/ink" xmlns:am3d="http://schemas.microsoft.com/office/drawing/2017/model3d" xmlns:o="urn:schemas-microsoft-com:office:office" xmlns:r="http://schemas.openxmlformats.org/officeDocument/2006/relationships" xmlns:m="http://schemas.openxmlformats.org/officeDocument/2006/math" xmlns:v="urn:schemas-microsoft-com:vml" xmlns:wp14="http://schemas.microsoft.com/office/word/2010/wordprocessingDrawing" xmlns:wp="http://schemas.openxmlformats.org/drawingml/2006/wordprocessingDrawing" xmlns:w10="urn:schemas-microsoft-com:office:word" xmlns:w="http://schemas.openxmlformats.org/wordprocessingml/2006/main" xmlns:w14="http://schemas.microsoft.com/office/word/2010/wordml" xmlns:w15="http://schemas.microsoft.com/office/word/2012/wordml" xmlns:w16cex="http://schemas.microsoft.com/office/word/2018/wordml/cex" xmlns:w16cid="http://schemas.microsoft.com/office/word/2016/wordml/cid" xmlns:w16="http://schemas.microsoft.com/office/word/2018/wordml" xmlns:w16sdtdh="http://schemas.microsoft.com/office/word/2020/wordml/sdtdatahash" xmlns:w16se="http://schemas.microsoft.com/office/word/2015/wordml/symex" xmlns:wpg="http://schemas.microsoft.com/office/word/2010/wordprocessingGroup" xmlns:wpi="http://schemas.microsoft.com/office/word/2010/wordprocessingInk" xmlns:wne="http://schemas.microsoft.com/office/word/2006/wordml" xmlns:wps="http://schemas.microsoft.com/office/word/2010/wordprocessingShape" mc:Ignorable="w14 w15 w16se w16cid w16 w16cex w16sdtdh wp14">
   <w:abstractNum w:abstractNumId="0" w15:restartNumberingAfterBreak="0">
     <w:nsid w:val="08B068A2"/>
     <w:multiLevelType w:val="multilevel"/>
@@ -3991,7 +4001,7 @@
 </file>
 
 <file path=word/styles.xml><?xml version="1.0" encoding="utf-8"?>
-<w:styles xmlns:mc="http://schemas.openxmlformats.org/markup-compatibility/2006" xmlns:r="http://schemas.openxmlformats.org/officeDocument/2006/relationships" xmlns:w="http://schemas.openxmlformats.org/wordprocessingml/2006/main" xmlns:w14="http://schemas.microsoft.com/office/word/2010/wordml" xmlns:w15="http://schemas.microsoft.com/office/word/2012/wordml" xmlns:w16se="http://schemas.microsoft.com/office/word/2015/wordml/symex" mc:Ignorable="w14 w15 w16se">
+<w:styles xmlns:mc="http://schemas.openxmlformats.org/markup-compatibility/2006" xmlns:r="http://schemas.openxmlformats.org/officeDocument/2006/relationships" xmlns:w="http://schemas.openxmlformats.org/wordprocessingml/2006/main" xmlns:w14="http://schemas.microsoft.com/office/word/2010/wordml" xmlns:w15="http://schemas.microsoft.com/office/word/2012/wordml" xmlns:w16cex="http://schemas.microsoft.com/office/word/2018/wordml/cex" xmlns:w16cid="http://schemas.microsoft.com/office/word/2016/wordml/cid" xmlns:w16="http://schemas.microsoft.com/office/word/2018/wordml" xmlns:w16sdtdh="http://schemas.microsoft.com/office/word/2020/wordml/sdtdatahash" xmlns:w16se="http://schemas.microsoft.com/office/word/2015/wordml/symex" mc:Ignorable="w14 w15 w16se w16cid w16 w16cex w16sdtdh">
   <w:docDefaults>
     <w:rPrDefault>
       <w:rPr>
@@ -4007,7 +4017,7 @@
       </w:pPr>
     </w:pPrDefault>
   </w:docDefaults>
-  <w:latentStyles w:defLockedState="0" w:defUIPriority="99" w:defSemiHidden="0" w:defUnhideWhenUsed="0" w:defQFormat="0" w:count="371">
+  <w:latentStyles w:defLockedState="0" w:defUIPriority="99" w:defSemiHidden="0" w:defUnhideWhenUsed="0" w:defQFormat="0" w:count="376">
     <w:lsdException w:name="Normal" w:uiPriority="0" w:qFormat="1"/>
     <w:lsdException w:name="heading 1" w:uiPriority="1" w:qFormat="1"/>
     <w:lsdException w:name="heading 2" w:semiHidden="1" w:uiPriority="1" w:unhideWhenUsed="1" w:qFormat="1"/>
@@ -4113,7 +4123,6 @@
     <w:lsdException w:name="HTML Sample" w:semiHidden="1" w:unhideWhenUsed="1"/>
     <w:lsdException w:name="HTML Typewriter" w:semiHidden="1" w:unhideWhenUsed="1"/>
     <w:lsdException w:name="HTML Variable" w:semiHidden="1" w:unhideWhenUsed="1"/>
-    <w:lsdException w:name="Normal Table" w:semiHidden="1" w:unhideWhenUsed="1"/>
     <w:lsdException w:name="annotation subject" w:semiHidden="1" w:unhideWhenUsed="1"/>
     <w:lsdException w:name="No List" w:semiHidden="1" w:unhideWhenUsed="1"/>
     <w:lsdException w:name="Outline List 1" w:semiHidden="1" w:unhideWhenUsed="1"/>
@@ -4156,11 +4165,8 @@
     <w:lsdException w:name="Table Contemporary" w:semiHidden="1" w:unhideWhenUsed="1"/>
     <w:lsdException w:name="Table Elegant" w:semiHidden="1" w:unhideWhenUsed="1"/>
     <w:lsdException w:name="Table Professional" w:semiHidden="1" w:unhideWhenUsed="1"/>
-    <w:lsdException w:name="Table Subtle 1" w:semiHidden="1" w:unhideWhenUsed="1"/>
     <w:lsdException w:name="Table Subtle 2" w:semiHidden="1" w:unhideWhenUsed="1"/>
     <w:lsdException w:name="Table Web 1" w:semiHidden="1" w:unhideWhenUsed="1"/>
-    <w:lsdException w:name="Table Web 2" w:semiHidden="1" w:unhideWhenUsed="1"/>
-    <w:lsdException w:name="Table Web 3" w:semiHidden="1" w:unhideWhenUsed="1"/>
     <w:lsdException w:name="Balloon Text" w:semiHidden="1" w:unhideWhenUsed="1"/>
     <w:lsdException w:name="Table Grid" w:uiPriority="39"/>
     <w:lsdException w:name="Table Theme" w:semiHidden="1" w:unhideWhenUsed="1"/>
@@ -4379,6 +4385,11 @@
     <w:lsdException w:name="List Table 5 Dark Accent 6" w:uiPriority="50"/>
     <w:lsdException w:name="List Table 6 Colorful Accent 6" w:uiPriority="51"/>
     <w:lsdException w:name="List Table 7 Colorful Accent 6" w:uiPriority="52"/>
+    <w:lsdException w:name="Mention" w:semiHidden="1" w:unhideWhenUsed="1"/>
+    <w:lsdException w:name="Smart Hyperlink" w:semiHidden="1" w:unhideWhenUsed="1"/>
+    <w:lsdException w:name="Hashtag" w:semiHidden="1" w:unhideWhenUsed="1"/>
+    <w:lsdException w:name="Unresolved Mention" w:semiHidden="1" w:unhideWhenUsed="1"/>
+    <w:lsdException w:name="Smart Link" w:semiHidden="1" w:unhideWhenUsed="1"/>
   </w:latentStyles>
   <w:style w:type="paragraph" w:default="1" w:styleId="a">
     <w:name w:val="Normal"/>

</xml_diff>